<commit_message>
docs(report-1): replace Cafeteria Ordering System sample diagram with VISTA feature decomposition mindmap
</commit_message>
<xml_diff>
--- a/docs/review-2/02-reports/report-1/SEP490_FA26SE183_R2_Report1.docx
+++ b/docs/review-2/02-reports/report-1/SEP490_FA26SE183_R2_Report1.docx
@@ -2732,6 +2732,7 @@
         <w:t>FE-05: Teacher assessment, feedback, learner reflection and progress evidence.</w:t>
       </w:r>
     </w:p>
+    <w:p/>
     <w:p>
       <w:pPr>
         <w:pStyle w:val="Fig-Graphic"/>
@@ -2780,6 +2781,20 @@
             </a:graphic>
           </wp:inline>
         </w:drawing>
+      </w:r>
+    </w:p>
+    <w:p>
+      <w:pPr>
+        <w:spacing w:before="80" w:after="160"/>
+        <w:jc w:val="center"/>
+      </w:pPr>
+      <w:r>
+        <w:rPr>
+          <w:i/>
+          <w:color w:val="475569"/>
+          <w:sz w:val="20"/>
+        </w:rPr>
+        <w:t>Figure 1. VISTA Platform — System Feature Decomposition Mindmap</w:t>
       </w:r>
     </w:p>
     <w:p>

</xml_diff>